<commit_message>
feat(templates & archive): update declarations template with new header, isolate operation submission files, and enable direct PDF preview for archived letters
</commit_message>
<xml_diff>
--- a/frontend/public/templates/booklet_and_insurance_template.docx
+++ b/frontend/public/templates/booklet_and_insurance_template.docx
@@ -1458,32 +1458,6 @@
           <w:lang w:bidi="ar-EG"/>
         </w:rPr>
       </w:pPr>
-    </w:p>
-    <w:p>
-      <w:pPr>
-        <w:spacing w:after="0" w:line="240" w:lineRule="auto"/>
-        <w:rPr>
-          <w:rtl/>
-          <w:lang w:bidi="ar-EG"/>
-        </w:rPr>
-      </w:pPr>
-      <w:r>
-        <w:rPr>
-          <w:rFonts w:hint="cs"/>
-          <w:highlight w:val="red"/>
-          <w:rtl/>
-          <w:lang w:bidi="ar-EG"/>
-        </w:rPr>
-        <w:t>خانه خاليه للملاحظات</w:t>
-      </w:r>
-      <w:r>
-        <w:rPr>
-          <w:rFonts w:hint="cs"/>
-          <w:rtl/>
-          <w:lang w:bidi="ar-EG"/>
-        </w:rPr>
-        <w:t xml:space="preserve">                                                                               </w:t>
-      </w:r>
     </w:p>
     <w:sectPr>
       <w:headerReference w:type="even" r:id="rId7"/>

</xml_diff>